<commit_message>
feat(milp): integrate user qualitative intro seamlessly with single-page OMML math formulation
</commit_message>
<xml_diff>
--- a/docs/Buoc_4_Dieu_phoi_toan_mang_MILP.docx
+++ b/docs/Buoc_4_Dieu_phoi_toan_mang_MILP.docx
@@ -4,339 +4,441 @@
   <w:body>
     <w:p>
       <w:pPr>
-        <w:spacing w:before="0" w:after="240"/>
-        <w:jc w:val="center"/>
+        <w:spacing w:before="0" w:after="100"/>
+      </w:pPr>
+      <w:r>
+        <w:rPr>
+          <w:rFonts w:ascii="Times New Roman" w:hAnsi="Times New Roman"/>
+          <w:b/>
+          <w:i/>
+          <w:color w:val="1565C0"/>
+          <w:sz w:val="27"/>
+        </w:rPr>
+        <w:t>Bước 4. Điều phối toàn mạng bằng MILP</w:t>
+      </w:r>
+    </w:p>
+    <w:p>
+      <w:pPr>
+        <w:spacing w:before="0" w:after="40" w:line="264" w:lineRule="auto"/>
+        <w:jc w:val="both"/>
+      </w:pPr>
+      <w:r>
+        <w:rPr>
+          <w:rFonts w:ascii="Times New Roman" w:hAnsi="Times New Roman"/>
+          <w:color w:val="212121"/>
+          <w:sz w:val="22"/>
+        </w:rPr>
+        <w:t>Ở bước này, FrostLink không chỉ ghép 1 nhu cầu - 1 xe, mà xem toàn bộ mạng lưới trong một khoảng thời gian (ví dụ 1 - 3 ngày):</w:t>
+      </w:r>
+    </w:p>
+    <w:p>
+      <w:pPr>
+        <w:spacing w:before="10" w:after="10"/>
+        <w:ind w:left="288"/>
+      </w:pPr>
+      <w:r>
+        <w:rPr>
+          <w:rFonts w:ascii="Times New Roman" w:hAnsi="Times New Roman"/>
+          <w:b/>
+          <w:sz w:val="22"/>
+        </w:rPr>
+        <w:t xml:space="preserve">• </w:t>
+      </w:r>
+      <w:r>
+        <w:rPr>
+          <w:rFonts w:ascii="Times New Roman" w:hAnsi="Times New Roman"/>
+          <w:color w:val="212121"/>
+          <w:sz w:val="22"/>
+        </w:rPr>
+        <w:t>Gom tất cả nhu cầu từ nhiều HTX, nhiều điểm gom hàng.</w:t>
+      </w:r>
+    </w:p>
+    <w:p>
+      <w:pPr>
+        <w:spacing w:before="10" w:after="10"/>
+        <w:ind w:left="288"/>
+      </w:pPr>
+      <w:r>
+        <w:rPr>
+          <w:rFonts w:ascii="Times New Roman" w:hAnsi="Times New Roman"/>
+          <w:b/>
+          <w:sz w:val="22"/>
+        </w:rPr>
+        <w:t xml:space="preserve">• </w:t>
+      </w:r>
+      <w:r>
+        <w:rPr>
+          <w:rFonts w:ascii="Times New Roman" w:hAnsi="Times New Roman"/>
+          <w:color w:val="212121"/>
+          <w:sz w:val="22"/>
+        </w:rPr>
+        <w:t>Gom tất cả xe khả dụng (của đối tác cố định + xe vãng lai).</w:t>
+      </w:r>
+    </w:p>
+    <w:p>
+      <w:pPr>
+        <w:spacing w:before="10" w:after="10"/>
+        <w:ind w:left="288"/>
+      </w:pPr>
+      <w:r>
+        <w:rPr>
+          <w:rFonts w:ascii="Times New Roman" w:hAnsi="Times New Roman"/>
+          <w:b/>
+          <w:sz w:val="22"/>
+        </w:rPr>
+        <w:t xml:space="preserve">• </w:t>
+      </w:r>
+      <w:r>
+        <w:rPr>
+          <w:rFonts w:ascii="Times New Roman" w:hAnsi="Times New Roman"/>
+          <w:color w:val="212121"/>
+          <w:sz w:val="22"/>
+        </w:rPr>
+        <w:t>Đưa vào mô hình Quy hoạch tuyến tính nguyên (MILP – Mixed Integer Linear Programming).</w:t>
+      </w:r>
+    </w:p>
+    <w:p>
+      <w:pPr>
+        <w:spacing w:before="10" w:after="10"/>
+        <w:ind w:left="288"/>
+      </w:pPr>
+      <w:r>
+        <w:rPr>
+          <w:rFonts w:ascii="Times New Roman" w:hAnsi="Times New Roman"/>
+          <w:b/>
+          <w:sz w:val="22"/>
+        </w:rPr>
+        <w:t xml:space="preserve">• </w:t>
+      </w:r>
+      <w:r>
+        <w:rPr>
+          <w:rFonts w:ascii="Times New Roman" w:hAnsi="Times New Roman"/>
+          <w:color w:val="212121"/>
+          <w:sz w:val="22"/>
+        </w:rPr>
+        <w:t>Sử dụng bộ giải như Gurobi / PuLP (Python) để tìm phương án phân bổ tối ưu toàn cục.</w:t>
+      </w:r>
+    </w:p>
+    <w:p>
+      <w:pPr>
+        <w:spacing w:before="60" w:after="20"/>
+      </w:pPr>
+      <w:r>
+        <w:rPr>
+          <w:rFonts w:ascii="Times New Roman" w:hAnsi="Times New Roman"/>
+          <w:b/>
+          <w:color w:val="212121"/>
+          <w:sz w:val="22"/>
+        </w:rPr>
+        <w:t>Mục tiêu của MILP:</w:t>
+      </w:r>
+    </w:p>
+    <w:p>
+      <w:pPr>
+        <w:spacing w:before="10" w:after="10"/>
+        <w:ind w:left="288"/>
+      </w:pPr>
+      <w:r>
+        <w:rPr>
+          <w:rFonts w:ascii="Times New Roman" w:hAnsi="Times New Roman"/>
+          <w:b/>
+          <w:sz w:val="22"/>
+        </w:rPr>
+        <w:t xml:space="preserve">• </w:t>
+      </w:r>
+      <w:r>
+        <w:rPr>
+          <w:rFonts w:ascii="Times New Roman" w:hAnsi="Times New Roman"/>
+          <w:color w:val="212121"/>
+          <w:sz w:val="22"/>
+        </w:rPr>
+        <w:t>Ghép nối đa chuyến: một xe có thể chạy nhiều chặng / nhiều điểm trong ngày.</w:t>
+      </w:r>
+    </w:p>
+    <w:p>
+      <w:pPr>
+        <w:spacing w:before="10" w:after="10"/>
+        <w:ind w:left="288"/>
+      </w:pPr>
+      <w:r>
+        <w:rPr>
+          <w:rFonts w:ascii="Times New Roman" w:hAnsi="Times New Roman"/>
+          <w:b/>
+          <w:sz w:val="22"/>
+        </w:rPr>
+        <w:t xml:space="preserve">• </w:t>
+      </w:r>
+      <w:r>
+        <w:rPr>
+          <w:rFonts w:ascii="Times New Roman" w:hAnsi="Times New Roman"/>
+          <w:color w:val="212121"/>
+          <w:sz w:val="22"/>
+        </w:rPr>
+        <w:t>Triệt tiêu km chạy rỗng: giảm tối đa quãng đường xe không có hàng.</w:t>
+      </w:r>
+    </w:p>
+    <w:p>
+      <w:pPr>
+        <w:spacing w:before="10" w:after="10"/>
+        <w:ind w:left="288"/>
+      </w:pPr>
+      <w:r>
+        <w:rPr>
+          <w:rFonts w:ascii="Times New Roman" w:hAnsi="Times New Roman"/>
+          <w:b/>
+          <w:sz w:val="22"/>
+        </w:rPr>
+        <w:t xml:space="preserve">• </w:t>
+      </w:r>
+      <w:r>
+        <w:rPr>
+          <w:rFonts w:ascii="Times New Roman" w:hAnsi="Times New Roman"/>
+          <w:color w:val="212121"/>
+          <w:sz w:val="22"/>
+        </w:rPr>
+        <w:t>Cân bằng tải: tránh tình trạng có nơi thừa xe, nơi thiếu xe.</w:t>
+      </w:r>
+    </w:p>
+    <w:p>
+      <w:pPr>
+        <w:spacing w:before="40" w:after="100"/>
+        <w:jc w:val="both"/>
+      </w:pPr>
+      <w:r>
+        <w:rPr>
+          <w:rFonts w:ascii="Times New Roman" w:hAnsi="Times New Roman"/>
+          <w:i/>
+          <w:color w:val="0D47A1"/>
+          <w:sz w:val="22"/>
+        </w:rPr>
+        <w:t>Nhờ MILP, FrostLink không chỉ có xe, mà còn có lộ trình xe hiệu quả nhất trên toàn mạng.</w:t>
+      </w:r>
+    </w:p>
+    <w:p>
+      <w:pPr>
+        <w:spacing w:before="80" w:after="40"/>
       </w:pPr>
       <w:r>
         <w:rPr>
           <w:rFonts w:ascii="Times New Roman" w:hAnsi="Times New Roman"/>
           <w:b/>
           <w:color w:val="1565C0"/>
-          <w:sz w:val="29"/>
+          <w:sz w:val="24"/>
         </w:rPr>
-        <w:t>BƯỚC 4. TỐI ƯU HÓA ĐIỀU PHỐI TOÀN MẠNG BẰNG QUY HOẠCH TUYẾN TÍNH NGUYÊN HỖN HỢP (MILP)</w:t>
+        <w:t>Mô hình hóa Toán học của Bài toán Điều phối MILP:</w:t>
       </w:r>
     </w:p>
     <w:p>
       <w:pPr>
-        <w:spacing w:before="0" w:after="160" w:line="288" w:lineRule="auto"/>
-        <w:jc w:val="both"/>
-      </w:pPr>
-      <w:r>
-        <w:rPr>
-          <w:rFonts w:ascii="Times New Roman" w:hAnsi="Times New Roman"/>
-          <w:color w:val="212121"/>
-          <w:sz w:val="24"/>
-        </w:rPr>
-        <w:t>Sau khi động cơ AI hoàn tất dự báo sản lượng và cơ chế Newsvendor xác lập hạn ngạch công suất xe lạnh cần thiết cho từng ngày, nền tảng FROSTLINK kích hoạt thuật toán Quy hoạch Tuyến tính Nguyên hỗn hợp (Mixed-Integer Linear Programming - MILP) để tự động hóa việc gán đơn hàng, ghép chuyến đa tầng (LTL gom hàng lẻ) và triệt tiêu quãng đường xe chạy rỗng (Deadhead km).</w:t>
-      </w:r>
-    </w:p>
-    <w:p>
-      <w:pPr>
-        <w:spacing w:before="160" w:after="80"/>
+        <w:spacing w:before="40" w:after="20"/>
       </w:pPr>
       <w:r>
         <w:rPr>
           <w:rFonts w:ascii="Times New Roman" w:hAnsi="Times New Roman"/>
           <w:b/>
           <w:color w:val="0D47A1"/>
-          <w:sz w:val="26"/>
+          <w:sz w:val="23"/>
         </w:rPr>
-        <w:t>1. Hệ thống Ký hiệu &amp; Biến số Mô hình</w:t>
+        <w:t>1. Hệ thống Biến quyết định &amp; Tham số:</w:t>
       </w:r>
     </w:p>
     <w:p>
       <w:pPr>
-        <w:spacing w:before="80" w:after="40"/>
+        <w:spacing w:before="10" w:after="20" w:line="252" w:lineRule="auto"/>
         <w:ind w:left="288"/>
       </w:pPr>
       <w:r>
         <w:rPr>
           <w:rFonts w:ascii="Times New Roman" w:hAnsi="Times New Roman"/>
           <w:b/>
-          <w:color w:val="212121"/>
-          <w:sz w:val="24"/>
+          <w:sz w:val="21"/>
         </w:rPr>
-        <w:t>• Tập hợp chỉ số (Sets):</w:t>
+        <w:t xml:space="preserve">• </w:t>
       </w:r>
-    </w:p>
-    <w:p>
-      <w:pPr>
-        <w:spacing w:before="20" w:after="40" w:line="276" w:lineRule="auto"/>
-        <w:ind w:left="648"/>
-      </w:pPr>
       <w:r>
         <w:rPr>
           <w:rFonts w:ascii="Times New Roman" w:hAnsi="Times New Roman"/>
           <w:b/>
           <w:i/>
-          <w:color w:val="212121"/>
-          <w:sz w:val="23"/>
+          <w:sz w:val="21"/>
         </w:rPr>
-        <w:t xml:space="preserve">- I: </w:t>
+        <w:t xml:space="preserve">x_ij ∈ {0, 1}: </w:t>
       </w:r>
       <w:r>
         <w:rPr>
           <w:rFonts w:ascii="Times New Roman" w:hAnsi="Times New Roman"/>
-          <w:color w:val="212121"/>
-          <w:sz w:val="23"/>
+          <w:sz w:val="21"/>
         </w:rPr>
-        <w:t>Tập hợp các đơn hàng thu hoạch từ các Hợp tác xã (i ∈ I).</w:t>
+        <w:t>Biến nhị phân phân bổ (x_ij = 1 nếu gán đơn hàng i cho xe j; bằng 0 nếu ngược lại).</w:t>
       </w:r>
     </w:p>
     <w:p>
       <w:pPr>
-        <w:spacing w:before="20" w:after="40" w:line="276" w:lineRule="auto"/>
-        <w:ind w:left="648"/>
-      </w:pPr>
-      <w:r>
-        <w:rPr>
-          <w:rFonts w:ascii="Times New Roman" w:hAnsi="Times New Roman"/>
-          <w:b/>
-          <w:i/>
-          <w:color w:val="212121"/>
-          <w:sz w:val="23"/>
-        </w:rPr>
-        <w:t xml:space="preserve">- J: </w:t>
-      </w:r>
-      <w:r>
-        <w:rPr>
-          <w:rFonts w:ascii="Times New Roman" w:hAnsi="Times New Roman"/>
-          <w:color w:val="212121"/>
-          <w:sz w:val="23"/>
-        </w:rPr>
-        <w:t>Tập hợp các phương tiện vận tải lạnh khả dụng trên mạng lưới (j ∈ J), gồm Container lạnh 40 feet (C_eff, Cont40 = 17.28 tấn) và Xe tải lạnh 5 tấn (C_eff, Truck5 = 4.80 tấn).</w:t>
-      </w:r>
-    </w:p>
-    <w:p>
-      <w:pPr>
-        <w:spacing w:before="80" w:after="40"/>
+        <w:spacing w:before="10" w:after="20" w:line="252" w:lineRule="auto"/>
         <w:ind w:left="288"/>
       </w:pPr>
       <w:r>
         <w:rPr>
           <w:rFonts w:ascii="Times New Roman" w:hAnsi="Times New Roman"/>
           <w:b/>
-          <w:color w:val="212121"/>
-          <w:sz w:val="24"/>
+          <w:sz w:val="21"/>
         </w:rPr>
-        <w:t>• Tham số kinh tế &amp; vận hành (Parameters):</w:t>
+        <w:t xml:space="preserve">• </w:t>
       </w:r>
-    </w:p>
-    <w:p>
-      <w:pPr>
-        <w:spacing w:before="20" w:after="40" w:line="276" w:lineRule="auto"/>
-        <w:ind w:left="648"/>
-      </w:pPr>
       <w:r>
         <w:rPr>
           <w:rFonts w:ascii="Times New Roman" w:hAnsi="Times New Roman"/>
           <w:b/>
           <w:i/>
-          <w:color w:val="212121"/>
-          <w:sz w:val="23"/>
+          <w:sz w:val="21"/>
         </w:rPr>
-        <w:t xml:space="preserve">- w_i: </w:t>
+        <w:t xml:space="preserve">y_j ∈ {0, 1}: </w:t>
       </w:r>
       <w:r>
         <w:rPr>
           <w:rFonts w:ascii="Times New Roman" w:hAnsi="Times New Roman"/>
-          <w:color w:val="212121"/>
-          <w:sz w:val="23"/>
+          <w:sz w:val="21"/>
         </w:rPr>
-        <w:t>Trọng lượng hàng hóa của đơn hàng i (Tấn).</w:t>
+        <w:t>Biến nhị phân kích hoạt phương tiện (y_j = 1 nếu xe j được huy động nổ máy; bằng 0 nếu xe nằm bãi để triệt tiêu chi phí mở xe).</w:t>
       </w:r>
     </w:p>
     <w:p>
       <w:pPr>
-        <w:spacing w:before="20" w:after="40" w:line="276" w:lineRule="auto"/>
-        <w:ind w:left="648"/>
-      </w:pPr>
-      <w:r>
-        <w:rPr>
-          <w:rFonts w:ascii="Times New Roman" w:hAnsi="Times New Roman"/>
-          <w:b/>
-          <w:i/>
-          <w:color w:val="212121"/>
-          <w:sz w:val="23"/>
-        </w:rPr>
-        <w:t xml:space="preserve">- C_j: </w:t>
-      </w:r>
-      <w:r>
-        <w:rPr>
-          <w:rFonts w:ascii="Times New Roman" w:hAnsi="Times New Roman"/>
-          <w:color w:val="212121"/>
-          <w:sz w:val="23"/>
-        </w:rPr>
-        <w:t>Tải trọng hữu dụng tối đa của phương tiện j (Tấn).</w:t>
-      </w:r>
-    </w:p>
-    <w:p>
-      <w:pPr>
-        <w:spacing w:before="20" w:after="40" w:line="276" w:lineRule="auto"/>
-        <w:ind w:left="648"/>
-      </w:pPr>
-      <w:r>
-        <w:rPr>
-          <w:rFonts w:ascii="Times New Roman" w:hAnsi="Times New Roman"/>
-          <w:b/>
-          <w:i/>
-          <w:color w:val="212121"/>
-          <w:sz w:val="23"/>
-        </w:rPr>
-        <w:t xml:space="preserve">- FixedCost_j: </w:t>
-      </w:r>
-      <w:r>
-        <w:rPr>
-          <w:rFonts w:ascii="Times New Roman" w:hAnsi="Times New Roman"/>
-          <w:color w:val="212121"/>
-          <w:sz w:val="23"/>
-        </w:rPr>
-        <w:t>Chi phí cố định mở xe khi phương tiện j được huy động nổ máy (VNĐ/xe).</w:t>
-      </w:r>
-    </w:p>
-    <w:p>
-      <w:pPr>
-        <w:spacing w:before="20" w:after="40" w:line="276" w:lineRule="auto"/>
-        <w:ind w:left="648"/>
-      </w:pPr>
-      <w:r>
-        <w:rPr>
-          <w:rFonts w:ascii="Times New Roman" w:hAnsi="Times New Roman"/>
-          <w:b/>
-          <w:i/>
-          <w:color w:val="212121"/>
-          <w:sz w:val="23"/>
-        </w:rPr>
-        <w:t xml:space="preserve">- DeadheadCost_ji: </w:t>
-      </w:r>
-      <w:r>
-        <w:rPr>
-          <w:rFonts w:ascii="Times New Roman" w:hAnsi="Times New Roman"/>
-          <w:color w:val="212121"/>
-          <w:sz w:val="23"/>
-        </w:rPr>
-        <w:t>Chi phí phát sinh do xe j chạy rỗng từ điểm định vị hiện tại đến điểm bốc hàng của HTX i (VNĐ).</w:t>
-      </w:r>
-    </w:p>
-    <w:p>
-      <w:pPr>
-        <w:spacing w:before="20" w:after="40" w:line="276" w:lineRule="auto"/>
-        <w:ind w:left="648"/>
-      </w:pPr>
-      <w:r>
-        <w:rPr>
-          <w:rFonts w:ascii="Times New Roman" w:hAnsi="Times New Roman"/>
-          <w:b/>
-          <w:i/>
-          <w:color w:val="212121"/>
-          <w:sz w:val="23"/>
-        </w:rPr>
-        <w:t xml:space="preserve">- TransitCost_ij: </w:t>
-      </w:r>
-      <w:r>
-        <w:rPr>
-          <w:rFonts w:ascii="Times New Roman" w:hAnsi="Times New Roman"/>
-          <w:color w:val="212121"/>
-          <w:sz w:val="23"/>
-        </w:rPr>
-        <w:t>Chi phí vận chuyển chính tuyến có tải từ HTX i đến cửa khẩu/kho phân phối (VNĐ).</w:t>
-      </w:r>
-    </w:p>
-    <w:p>
-      <w:pPr>
-        <w:spacing w:before="80" w:after="40"/>
+        <w:spacing w:before="10" w:after="20" w:line="252" w:lineRule="auto"/>
         <w:ind w:left="288"/>
       </w:pPr>
       <w:r>
         <w:rPr>
           <w:rFonts w:ascii="Times New Roman" w:hAnsi="Times New Roman"/>
           <w:b/>
-          <w:color w:val="212121"/>
-          <w:sz w:val="24"/>
+          <w:sz w:val="21"/>
         </w:rPr>
-        <w:t>• Biến quyết định (Decision Variables):</w:t>
+        <w:t xml:space="preserve">• </w:t>
+      </w:r>
+      <w:r>
+        <w:rPr>
+          <w:rFonts w:ascii="Times New Roman" w:hAnsi="Times New Roman"/>
+          <w:b/>
+          <w:i/>
+          <w:sz w:val="21"/>
+        </w:rPr>
+        <w:t xml:space="preserve">w_i, C_j: </w:t>
+      </w:r>
+      <w:r>
+        <w:rPr>
+          <w:rFonts w:ascii="Times New Roman" w:hAnsi="Times New Roman"/>
+          <w:sz w:val="21"/>
+        </w:rPr>
+        <w:t>w_i là khối lượng hàng của đơn i (Tấn); C_j là tải trọng hữu dụng của xe j (Cont 40ft = 17.28T; Xe 5T = 4.80T).</w:t>
       </w:r>
     </w:p>
     <w:p>
       <w:pPr>
-        <w:spacing w:before="20" w:after="40" w:line="276" w:lineRule="auto"/>
-        <w:ind w:left="648"/>
+        <w:spacing w:before="10" w:after="20" w:line="252" w:lineRule="auto"/>
+        <w:ind w:left="288"/>
       </w:pPr>
       <w:r>
         <w:rPr>
           <w:rFonts w:ascii="Times New Roman" w:hAnsi="Times New Roman"/>
           <w:b/>
-          <w:i/>
-          <w:color w:val="212121"/>
-          <w:sz w:val="23"/>
+          <w:sz w:val="21"/>
         </w:rPr>
-        <w:t xml:space="preserve">- x_ij ∈ {0, 1}: </w:t>
+        <w:t xml:space="preserve">• </w:t>
       </w:r>
       <w:r>
         <w:rPr>
           <w:rFonts w:ascii="Times New Roman" w:hAnsi="Times New Roman"/>
-          <w:color w:val="212121"/>
-          <w:sz w:val="23"/>
+          <w:b/>
+          <w:i/>
+          <w:sz w:val="21"/>
         </w:rPr>
-        <w:t>Biến nhị phân phân bổ, x_ij = 1 nếu đơn hàng i được phân bổ cho phương tiện j; x_ij = 0 nếu ngược lại.</w:t>
+        <w:t xml:space="preserve">FixedCost_j: </w:t>
+      </w:r>
+      <w:r>
+        <w:rPr>
+          <w:rFonts w:ascii="Times New Roman" w:hAnsi="Times New Roman"/>
+          <w:sz w:val="21"/>
+        </w:rPr>
+        <w:t>Chi phí thuê xe cơ sở khi xe j lăn bánh (9.0 triệu/cont 40ft; 3.5 triệu/xe 5T).</w:t>
       </w:r>
     </w:p>
     <w:p>
       <w:pPr>
-        <w:spacing w:before="20" w:after="40" w:line="276" w:lineRule="auto"/>
-        <w:ind w:left="648"/>
+        <w:spacing w:before="10" w:after="20" w:line="252" w:lineRule="auto"/>
+        <w:ind w:left="288"/>
       </w:pPr>
       <w:r>
         <w:rPr>
           <w:rFonts w:ascii="Times New Roman" w:hAnsi="Times New Roman"/>
           <w:b/>
-          <w:i/>
-          <w:color w:val="212121"/>
-          <w:sz w:val="23"/>
+          <w:sz w:val="21"/>
         </w:rPr>
-        <w:t xml:space="preserve">- y_j ∈ {0, 1}: </w:t>
+        <w:t xml:space="preserve">• </w:t>
       </w:r>
       <w:r>
         <w:rPr>
           <w:rFonts w:ascii="Times New Roman" w:hAnsi="Times New Roman"/>
-          <w:color w:val="212121"/>
-          <w:sz w:val="23"/>
+          <w:b/>
+          <w:i/>
+          <w:sz w:val="21"/>
         </w:rPr>
-        <w:t>Biến nhị phân kích hoạt phương tiện, y_j = 1 nếu xe j được huy động lăn bánh; y_j = 0 nếu xe nằm bãi (tránh phát sinh chi phí mở xe cố định).</w:t>
+        <w:t xml:space="preserve">DeadheadCost_ji: </w:t>
+      </w:r>
+      <w:r>
+        <w:rPr>
+          <w:rFonts w:ascii="Times New Roman" w:hAnsi="Times New Roman"/>
+          <w:sz w:val="21"/>
+        </w:rPr>
+        <w:t>Chi phí phát sinh do xe chạy rỗng tiếp cận điểm đóng hàng (18.000 VNĐ/km rỗng).</w:t>
       </w:r>
     </w:p>
     <w:p>
       <w:pPr>
-        <w:spacing w:before="200" w:after="80"/>
+        <w:spacing w:before="10" w:after="20" w:line="252" w:lineRule="auto"/>
+        <w:ind w:left="288"/>
+      </w:pPr>
+      <w:r>
+        <w:rPr>
+          <w:rFonts w:ascii="Times New Roman" w:hAnsi="Times New Roman"/>
+          <w:b/>
+          <w:sz w:val="21"/>
+        </w:rPr>
+        <w:t xml:space="preserve">• </w:t>
+      </w:r>
+      <w:r>
+        <w:rPr>
+          <w:rFonts w:ascii="Times New Roman" w:hAnsi="Times New Roman"/>
+          <w:b/>
+          <w:i/>
+          <w:sz w:val="21"/>
+        </w:rPr>
+        <w:t xml:space="preserve">TransitCost_ij: </w:t>
+      </w:r>
+      <w:r>
+        <w:rPr>
+          <w:rFonts w:ascii="Times New Roman" w:hAnsi="Times New Roman"/>
+          <w:sz w:val="21"/>
+        </w:rPr>
+        <w:t>Cước phí vận chuyển chính tuyến có tải từ HTX i đến cửa khẩu/kho đích.</w:t>
+      </w:r>
+    </w:p>
+    <w:p>
+      <w:pPr>
+        <w:spacing w:before="80" w:after="20"/>
       </w:pPr>
       <w:r>
         <w:rPr>
           <w:rFonts w:ascii="Times New Roman" w:hAnsi="Times New Roman"/>
           <w:b/>
           <w:color w:val="0D47A1"/>
-          <w:sz w:val="26"/>
+          <w:sz w:val="23"/>
         </w:rPr>
-        <w:t>2. Hàm Mục tiêu (Objective Function - Tối thiểu hóa Tổng chi phí Hệ thống)</w:t>
+        <w:t>2. Hàm mục tiêu (Tối thiểu hóa Tổng chi phí Vận hành Toàn mạng):</w:t>
       </w:r>
     </w:p>
     <w:p>
       <w:pPr>
-        <w:spacing w:before="0" w:after="80" w:line="288" w:lineRule="auto"/>
-        <w:jc w:val="both"/>
-      </w:pPr>
-      <w:r>
-        <w:rPr>
-          <w:rFonts w:ascii="Times New Roman" w:hAnsi="Times New Roman"/>
-          <w:color w:val="212121"/>
-          <w:sz w:val="24"/>
-        </w:rPr>
-        <w:t>Hàm mục tiêu tìm kiếm phương án phân bổ sao cho tổng chi phí vận hành toàn mạng lưới đạt mức nhỏ nhất, bao gồm chi phí cố định mở xe, chi phí chạy rỗng tiếp cận và chi phí lăn bánh chính tuyến:</w:t>
-      </w:r>
-    </w:p>
-    <w:p>
-      <w:pPr>
-        <w:spacing w:before="80" w:after="120"/>
+        <w:spacing w:before="30" w:after="30"/>
         <w:jc w:val="center"/>
       </w:pPr>
       <m:oMathPara>
@@ -499,43 +601,50 @@
     </w:p>
     <w:p>
       <w:pPr>
-        <w:spacing w:before="200" w:after="80"/>
+        <w:spacing w:before="0" w:after="60"/>
+        <w:jc w:val="center"/>
+      </w:pPr>
+      <w:r>
+        <w:rPr>
+          <w:rFonts w:ascii="Times New Roman" w:hAnsi="Times New Roman"/>
+          <w:i/>
+          <w:color w:val="0D47A1"/>
+          <w:sz w:val="20"/>
+        </w:rPr>
+        <w:t>(Ý nghĩa: Triệt tiêu tối đa chi phí mở xe thừa và giảm thiểu chi phí xe chạy rỗng deadhead).</w:t>
+      </w:r>
+    </w:p>
+    <w:p>
+      <w:pPr>
+        <w:spacing w:before="60" w:after="20"/>
       </w:pPr>
       <w:r>
         <w:rPr>
           <w:rFonts w:ascii="Times New Roman" w:hAnsi="Times New Roman"/>
           <w:b/>
           <w:color w:val="0D47A1"/>
-          <w:sz w:val="26"/>
+          <w:sz w:val="23"/>
         </w:rPr>
-        <w:t>3. Các Ràng buộc Kỹ thuật &amp; Nghiệp vụ Chuỗi lạnh (Subject to Constraints)</w:t>
+        <w:t>3. Các Ràng buộc Kỹ thuật Cốt lõi (Subject to Constraints):</w:t>
       </w:r>
     </w:p>
     <w:p>
       <w:pPr>
-        <w:spacing w:before="80" w:after="40" w:line="276" w:lineRule="auto"/>
+        <w:spacing w:before="30" w:after="10"/>
+        <w:ind w:left="216"/>
       </w:pPr>
       <w:r>
         <w:rPr>
           <w:rFonts w:ascii="Times New Roman" w:hAnsi="Times New Roman"/>
           <w:b/>
-          <w:color w:val="212121"/>
-          <w:sz w:val="24"/>
+          <w:sz w:val="21"/>
         </w:rPr>
-        <w:t xml:space="preserve">• Ràng buộc Phục vụ Đơn nhất (Assignment Constraint): </w:t>
-      </w:r>
-      <w:r>
-        <w:rPr>
-          <w:rFonts w:ascii="Times New Roman" w:hAnsi="Times New Roman"/>
-          <w:color w:val="212121"/>
-          <w:sz w:val="24"/>
-        </w:rPr>
-        <w:t>Đảm bảo 100% các lô hàng của HTX đều được vận chuyển và mỗi lô hàng chỉ do đúng một phương tiện tiếp nhận:</w:t>
+        <w:t>• Ràng buộc phục vụ 100% đơn hàng (Mỗi lô hàng của HTX phải được đúng 1 xe tiếp nhận):</w:t>
       </w:r>
     </w:p>
     <w:p>
       <w:pPr>
-        <w:spacing w:before="40" w:after="100"/>
+        <w:spacing w:before="20" w:after="30"/>
         <w:jc w:val="center"/>
       </w:pPr>
       <m:oMathPara>
@@ -580,29 +689,21 @@
     </w:p>
     <w:p>
       <w:pPr>
-        <w:spacing w:before="80" w:after="40" w:line="276" w:lineRule="auto"/>
+        <w:spacing w:before="30" w:after="10"/>
+        <w:ind w:left="216"/>
       </w:pPr>
       <w:r>
         <w:rPr>
           <w:rFonts w:ascii="Times New Roman" w:hAnsi="Times New Roman"/>
           <w:b/>
-          <w:color w:val="212121"/>
-          <w:sz w:val="24"/>
+          <w:sz w:val="21"/>
         </w:rPr>
-        <w:t xml:space="preserve">• Ràng buộc Tải trọng Hữu dụng &amp; Kích hoạt Phương tiện (Capacity &amp; Linking Constraint): </w:t>
-      </w:r>
-      <w:r>
-        <w:rPr>
-          <w:rFonts w:ascii="Times New Roman" w:hAnsi="Times New Roman"/>
-          <w:color w:val="212121"/>
-          <w:sz w:val="24"/>
-        </w:rPr>
-        <w:t>Tổng khối lượng hàng hóa của các đơn gán lên phương tiện j không được vượt quá tải trọng thiết kế cho phép, đồng thời ràng buộc xe j chỉ được chở hàng khi và chỉ khi xe đó đã được kích hoạt nổ máy (y_j = 1):</w:t>
+        <w:t>• Ràng buộc tải trọng hữu dụng &amp; liên kết kích hoạt xe (Không chở quá tải, chỉ gán cho xe đã kích hoạt y_j = 1):</w:t>
       </w:r>
     </w:p>
     <w:p>
       <w:pPr>
-        <w:spacing w:before="40" w:after="100"/>
+        <w:spacing w:before="20" w:after="30"/>
         <w:jc w:val="center"/>
       </w:pPr>
       <m:oMathPara>
@@ -692,29 +793,21 @@
     </w:p>
     <w:p>
       <w:pPr>
-        <w:spacing w:before="80" w:after="40" w:line="276" w:lineRule="auto"/>
+        <w:spacing w:before="30" w:after="10"/>
+        <w:ind w:left="216"/>
       </w:pPr>
       <w:r>
         <w:rPr>
           <w:rFonts w:ascii="Times New Roman" w:hAnsi="Times New Roman"/>
           <w:b/>
-          <w:color w:val="212121"/>
-          <w:sz w:val="24"/>
+          <w:sz w:val="21"/>
         </w:rPr>
-        <w:t xml:space="preserve">• Ràng buộc Tương thích Chuỗi lạnh &amp; Vệ sinh An toàn Thực phẩm (Compatibility Filter): </w:t>
-      </w:r>
-      <w:r>
-        <w:rPr>
-          <w:rFonts w:ascii="Times New Roman" w:hAnsi="Times New Roman"/>
-          <w:color w:val="212121"/>
-          <w:sz w:val="24"/>
-        </w:rPr>
-        <w:t>Tự động loại bỏ và gán x_ij = 0 đối với bất kỳ phương tiện j nào không thỏa mãn dải nhiệt độ bảo quản vải thiều (2°C – 4°C) hoặc xe vừa chở các mặt hàng kỵ mùi chưa qua tiêu độc khử trùng:</w:t>
+        <w:t>• Ràng buộc tương thích chuỗi lạnh &amp; an toàn thực phẩm (Loại bỏ phương tiện không đạt dải nhiệt độ 2°C – 4°C):</w:t>
       </w:r>
     </w:p>
     <w:p>
       <w:pPr>
-        <w:spacing w:before="40" w:after="100"/>
+        <w:spacing w:before="20" w:after="40"/>
         <w:jc w:val="center"/>
       </w:pPr>
       <m:oMathPara>
@@ -748,724 +841,34 @@
     </w:p>
     <w:p>
       <w:pPr>
-        <w:spacing w:before="80" w:after="40"/>
-      </w:pPr>
-      <w:r>
-        <w:rPr>
-          <w:rFonts w:ascii="Times New Roman" w:hAnsi="Times New Roman"/>
-          <w:b/>
-          <w:color w:val="212121"/>
-          <w:sz w:val="24"/>
-        </w:rPr>
-        <w:t>• Ràng buộc Miền giá trị Biến nhị phân (Binary Integrality):</w:t>
-      </w:r>
-    </w:p>
-    <w:p>
-      <w:pPr>
-        <w:spacing w:before="40" w:after="120"/>
-        <w:jc w:val="center"/>
-      </w:pPr>
-      <m:oMathPara>
-        <m:oMath>
-          <m:sSub>
-            <m:e>
-              <m:r>
-                <m:t>x</m:t>
-              </m:r>
-            </m:e>
-            <m:sub>
-              <m:r>
-                <m:t>ij</m:t>
-              </m:r>
-            </m:sub>
-          </m:sSub>
-          <m:r>
-            <m:t>∈{0,1},</m:t>
-          </m:r>
-          <m:r>
-            <m:t>∀i∈I,</m:t>
-          </m:r>
-          <m:r>
-            <m:t>j∈J;</m:t>
-          </m:r>
-          <m:sSub>
-            <m:e>
-              <m:r>
-                <m:t>y</m:t>
-              </m:r>
-            </m:e>
-            <m:sub>
-              <m:r>
-                <m:t>j</m:t>
-              </m:r>
-            </m:sub>
-          </m:sSub>
-          <m:r>
-            <m:t>∈{0,1},</m:t>
-          </m:r>
-          <m:r>
-            <m:t>∀j∈J</m:t>
-          </m:r>
-        </m:oMath>
-      </m:oMathPara>
-    </w:p>
-    <w:p>
-      <w:pPr>
-        <w:spacing w:before="160" w:after="80"/>
+        <w:spacing w:before="60" w:after="20"/>
       </w:pPr>
       <w:r>
         <w:rPr>
           <w:rFonts w:ascii="Times New Roman" w:hAnsi="Times New Roman"/>
           <w:b/>
           <w:color w:val="0D47A1"/>
-          <w:sz w:val="26"/>
+          <w:sz w:val="23"/>
         </w:rPr>
-        <w:t>4. Cơ chế Thực thi Thuật toán (Algorithmic Execution)</w:t>
+        <w:t>4. Hiệu quả Thực thi Thuật toán:</w:t>
       </w:r>
     </w:p>
     <w:p>
       <w:pPr>
-        <w:spacing w:before="0" w:after="200" w:line="288" w:lineRule="auto"/>
+        <w:spacing w:before="0" w:after="0" w:line="264" w:lineRule="auto"/>
         <w:jc w:val="both"/>
       </w:pPr>
       <w:r>
         <w:rPr>
           <w:rFonts w:ascii="Times New Roman" w:hAnsi="Times New Roman"/>
-          <w:color w:val="212121"/>
-          <w:sz w:val="24"/>
+          <w:sz w:val="21"/>
         </w:rPr>
-        <w:t>Mô hình MILP được lập trình tự động hóa bằng ngôn ngữ Python thông qua thư viện mô hình hóa toán học PuLP và giải nghiệm bằng bộ giải thuật toán nhánh và cận (Branch-and-Cut) công nghiệp CBC / Gurobi. Thời gian tính toán cho quy mô toàn bộ 15 Hợp tác xã huyện Lục Ngạn và 50 phương tiện vận tải dao động dưới 1.8 giây, cho phép nền tảng tự động tái điều phối tức thời (Dynamic Dispatching) khi có biến động hủy đơn hoặc thời tiết mưa dông bất thường.</w:t>
+        <w:t>Mô hình được lập trình và giải tự động trên Python bằng bộ giải CBC / Gurobi. Với quy mô 15 HTX Lục Ngạn và đội xe 40–50 phương tiện, thời gian giải bài toán tối ưu toàn cục chỉ mất dưới 1.8 giây, cho phép tái điều phối tức thời khi thời tiết mưa bão làm thay đổi kế hoạch thu hái.</w:t>
       </w:r>
     </w:p>
-    <w:p>
-      <w:pPr>
-        <w:spacing w:before="120" w:after="80"/>
-      </w:pPr>
-      <w:r>
-        <w:rPr>
-          <w:rFonts w:ascii="Times New Roman" w:hAnsi="Times New Roman"/>
-          <w:b/>
-          <w:color w:val="1565C0"/>
-          <w:sz w:val="23"/>
-        </w:rPr>
-        <w:t>Bảng 4.2. Định mức Tham số Kỹ thuật &amp; Kinh tế trong Mô hình Điều phối MILP</w:t>
-      </w:r>
-    </w:p>
-    <w:tbl>
-      <w:tblPr>
-        <w:tblW w:type="auto" w:w="0"/>
-        <w:jc w:val="center"/>
-        <w:tblLayout w:type="fixed"/>
-        <w:tblLook w:firstColumn="1" w:firstRow="1" w:lastColumn="0" w:lastRow="0" w:noHBand="0" w:noVBand="1" w:val="04A0"/>
-        <w:tblBorders>
-          <w:top w:val="single" w:sz="6" w:space="0" w:color="1565C0"/>
-          <w:bottom w:val="single" w:sz="6" w:space="0" w:color="1565C0"/>
-          <w:left w:val="none"/>
-          <w:right w:val="none"/>
-          <w:insideH w:val="single" w:sz="4" w:space="0" w:color="E0E0E0"/>
-          <w:insideV w:val="none"/>
-        </w:tblBorders>
-      </w:tblPr>
-      <w:tblGrid>
-        <w:gridCol w:w="3010"/>
-        <w:gridCol w:w="3010"/>
-        <w:gridCol w:w="3010"/>
-      </w:tblGrid>
-      <w:tr>
-        <w:trPr>
-          <w:cantSplit/>
-          <w:tblHeader/>
-        </w:trPr>
-        <w:tc>
-          <w:tcPr>
-            <w:tcW w:type="dxa" w:w="2592"/>
-            <w:shd w:fill="1565C0"/>
-            <w:tcMar>
-              <w:top w:w="70" w:type="dxa"/>
-              <w:bottom w:w="70" w:type="dxa"/>
-              <w:left w:w="70" w:type="dxa"/>
-              <w:right w:w="70" w:type="dxa"/>
-            </w:tcMar>
-          </w:tcPr>
-          <w:p>
-            <w:pPr>
-              <w:spacing w:before="80" w:after="80"/>
-              <w:jc w:val="left"/>
-            </w:pPr>
-            <w:r>
-              <w:rPr>
-                <w:rFonts w:ascii="Times New Roman" w:hAnsi="Times New Roman"/>
-                <w:b/>
-                <w:color w:val="FFFFFF"/>
-                <w:sz w:val="21"/>
-              </w:rPr>
-              <w:t>Ký hiệu / Tham số</w:t>
-            </w:r>
-          </w:p>
-        </w:tc>
-        <w:tc>
-          <w:tcPr>
-            <w:tcW w:type="dxa" w:w="2160"/>
-            <w:shd w:fill="1565C0"/>
-            <w:tcMar>
-              <w:top w:w="70" w:type="dxa"/>
-              <w:bottom w:w="70" w:type="dxa"/>
-              <w:left w:w="70" w:type="dxa"/>
-              <w:right w:w="70" w:type="dxa"/>
-            </w:tcMar>
-          </w:tcPr>
-          <w:p>
-            <w:pPr>
-              <w:spacing w:before="80" w:after="80"/>
-              <w:jc w:val="center"/>
-            </w:pPr>
-            <w:r>
-              <w:rPr>
-                <w:rFonts w:ascii="Times New Roman" w:hAnsi="Times New Roman"/>
-                <w:b/>
-                <w:color w:val="FFFFFF"/>
-                <w:sz w:val="21"/>
-              </w:rPr>
-              <w:t>Định mức Thực tế</w:t>
-            </w:r>
-          </w:p>
-        </w:tc>
-        <w:tc>
-          <w:tcPr>
-            <w:tcW w:type="dxa" w:w="4277"/>
-            <w:shd w:fill="1565C0"/>
-            <w:tcMar>
-              <w:top w:w="70" w:type="dxa"/>
-              <w:bottom w:w="70" w:type="dxa"/>
-              <w:left w:w="70" w:type="dxa"/>
-              <w:right w:w="70" w:type="dxa"/>
-            </w:tcMar>
-          </w:tcPr>
-          <w:p>
-            <w:pPr>
-              <w:spacing w:before="80" w:after="80"/>
-              <w:jc w:val="left"/>
-            </w:pPr>
-            <w:r>
-              <w:rPr>
-                <w:rFonts w:ascii="Times New Roman" w:hAnsi="Times New Roman"/>
-                <w:b/>
-                <w:color w:val="FFFFFF"/>
-                <w:sz w:val="21"/>
-              </w:rPr>
-              <w:t>Ý nghĩa Vận hành Chuỗi lạnh</w:t>
-            </w:r>
-          </w:p>
-        </w:tc>
-      </w:tr>
-      <w:tr>
-        <w:trPr>
-          <w:cantSplit/>
-        </w:trPr>
-        <w:tc>
-          <w:tcPr>
-            <w:tcW w:type="dxa" w:w="2592"/>
-            <w:shd w:fill="F8F9FA"/>
-            <w:tcMar>
-              <w:top w:w="50" w:type="dxa"/>
-              <w:bottom w:w="50" w:type="dxa"/>
-              <w:left w:w="70" w:type="dxa"/>
-              <w:right w:w="70" w:type="dxa"/>
-            </w:tcMar>
-          </w:tcPr>
-          <w:p>
-            <w:pPr>
-              <w:spacing w:before="60" w:after="60"/>
-              <w:jc w:val="left"/>
-            </w:pPr>
-            <w:r>
-              <w:rPr>
-                <w:rFonts w:ascii="Times New Roman" w:hAnsi="Times New Roman"/>
-                <w:b/>
-                <w:color w:val="212121"/>
-                <w:sz w:val="20"/>
-              </w:rPr>
-              <w:t>C_eff, Cont40</w:t>
-            </w:r>
-          </w:p>
-        </w:tc>
-        <w:tc>
-          <w:tcPr>
-            <w:tcW w:type="dxa" w:w="2160"/>
-            <w:shd w:fill="F8F9FA"/>
-            <w:tcMar>
-              <w:top w:w="50" w:type="dxa"/>
-              <w:bottom w:w="50" w:type="dxa"/>
-              <w:left w:w="70" w:type="dxa"/>
-              <w:right w:w="70" w:type="dxa"/>
-            </w:tcMar>
-          </w:tcPr>
-          <w:p>
-            <w:pPr>
-              <w:spacing w:before="60" w:after="60"/>
-              <w:jc w:val="center"/>
-            </w:pPr>
-            <w:r>
-              <w:rPr>
-                <w:rFonts w:ascii="Consolas" w:hAnsi="Consolas"/>
-                <w:color w:val="212121"/>
-                <w:sz w:val="19"/>
-              </w:rPr>
-              <w:t>17.28 Tấn/cont</w:t>
-            </w:r>
-          </w:p>
-        </w:tc>
-        <w:tc>
-          <w:tcPr>
-            <w:tcW w:type="dxa" w:w="4277"/>
-            <w:shd w:fill="F8F9FA"/>
-            <w:tcMar>
-              <w:top w:w="50" w:type="dxa"/>
-              <w:bottom w:w="50" w:type="dxa"/>
-              <w:left w:w="70" w:type="dxa"/>
-              <w:right w:w="70" w:type="dxa"/>
-            </w:tcMar>
-          </w:tcPr>
-          <w:p>
-            <w:pPr>
-              <w:spacing w:before="60" w:after="60"/>
-              <w:jc w:val="left"/>
-            </w:pPr>
-            <w:r>
-              <w:rPr>
-                <w:rFonts w:ascii="Times New Roman" w:hAnsi="Times New Roman"/>
-                <w:color w:val="212121"/>
-                <w:sz w:val="20"/>
-              </w:rPr>
-              <w:t>Tải trọng hữu dụng Container lạnh 40 feet (18.0 tấn × 0.96 chừa 4% lưu thông khí lạnh 2°C - 4°C).</w:t>
-            </w:r>
-          </w:p>
-        </w:tc>
-      </w:tr>
-      <w:tr>
-        <w:trPr>
-          <w:cantSplit/>
-        </w:trPr>
-        <w:tc>
-          <w:tcPr>
-            <w:tcW w:type="dxa" w:w="2592"/>
-            <w:shd w:fill="FFFFFF"/>
-            <w:tcMar>
-              <w:top w:w="50" w:type="dxa"/>
-              <w:bottom w:w="50" w:type="dxa"/>
-              <w:left w:w="70" w:type="dxa"/>
-              <w:right w:w="70" w:type="dxa"/>
-            </w:tcMar>
-          </w:tcPr>
-          <w:p>
-            <w:pPr>
-              <w:spacing w:before="60" w:after="60"/>
-              <w:jc w:val="left"/>
-            </w:pPr>
-            <w:r>
-              <w:rPr>
-                <w:rFonts w:ascii="Times New Roman" w:hAnsi="Times New Roman"/>
-                <w:b/>
-                <w:color w:val="212121"/>
-                <w:sz w:val="20"/>
-              </w:rPr>
-              <w:t>C_eff, Truck5</w:t>
-            </w:r>
-          </w:p>
-        </w:tc>
-        <w:tc>
-          <w:tcPr>
-            <w:tcW w:type="dxa" w:w="2160"/>
-            <w:shd w:fill="FFFFFF"/>
-            <w:tcMar>
-              <w:top w:w="50" w:type="dxa"/>
-              <w:bottom w:w="50" w:type="dxa"/>
-              <w:left w:w="70" w:type="dxa"/>
-              <w:right w:w="70" w:type="dxa"/>
-            </w:tcMar>
-          </w:tcPr>
-          <w:p>
-            <w:pPr>
-              <w:spacing w:before="60" w:after="60"/>
-              <w:jc w:val="center"/>
-            </w:pPr>
-            <w:r>
-              <w:rPr>
-                <w:rFonts w:ascii="Consolas" w:hAnsi="Consolas"/>
-                <w:color w:val="212121"/>
-                <w:sz w:val="19"/>
-              </w:rPr>
-              <w:t>4.80 Tấn/xe</w:t>
-            </w:r>
-          </w:p>
-        </w:tc>
-        <w:tc>
-          <w:tcPr>
-            <w:tcW w:type="dxa" w:w="4277"/>
-            <w:shd w:fill="FFFFFF"/>
-            <w:tcMar>
-              <w:top w:w="50" w:type="dxa"/>
-              <w:bottom w:w="50" w:type="dxa"/>
-              <w:left w:w="70" w:type="dxa"/>
-              <w:right w:w="70" w:type="dxa"/>
-            </w:tcMar>
-          </w:tcPr>
-          <w:p>
-            <w:pPr>
-              <w:spacing w:before="60" w:after="60"/>
-              <w:jc w:val="left"/>
-            </w:pPr>
-            <w:r>
-              <w:rPr>
-                <w:rFonts w:ascii="Times New Roman" w:hAnsi="Times New Roman"/>
-                <w:color w:val="212121"/>
-                <w:sz w:val="20"/>
-              </w:rPr>
-              <w:t>Tải trọng hữu dụng Xe tải lạnh 5 tấn (5.0 tấn × 0.96 giải tỏa các lô hàng lẻ LTL).</w:t>
-            </w:r>
-          </w:p>
-        </w:tc>
-      </w:tr>
-      <w:tr>
-        <w:trPr>
-          <w:cantSplit/>
-        </w:trPr>
-        <w:tc>
-          <w:tcPr>
-            <w:tcW w:type="dxa" w:w="2592"/>
-            <w:shd w:fill="F8F9FA"/>
-            <w:tcMar>
-              <w:top w:w="50" w:type="dxa"/>
-              <w:bottom w:w="50" w:type="dxa"/>
-              <w:left w:w="70" w:type="dxa"/>
-              <w:right w:w="70" w:type="dxa"/>
-            </w:tcMar>
-          </w:tcPr>
-          <w:p>
-            <w:pPr>
-              <w:spacing w:before="60" w:after="60"/>
-              <w:jc w:val="left"/>
-            </w:pPr>
-            <w:r>
-              <w:rPr>
-                <w:rFonts w:ascii="Times New Roman" w:hAnsi="Times New Roman"/>
-                <w:b/>
-                <w:color w:val="212121"/>
-                <w:sz w:val="20"/>
-              </w:rPr>
-              <w:t>FixedCost_j (Cont 40ft)</w:t>
-            </w:r>
-          </w:p>
-        </w:tc>
-        <w:tc>
-          <w:tcPr>
-            <w:tcW w:type="dxa" w:w="2160"/>
-            <w:shd w:fill="F8F9FA"/>
-            <w:tcMar>
-              <w:top w:w="50" w:type="dxa"/>
-              <w:bottom w:w="50" w:type="dxa"/>
-              <w:left w:w="70" w:type="dxa"/>
-              <w:right w:w="70" w:type="dxa"/>
-            </w:tcMar>
-          </w:tcPr>
-          <w:p>
-            <w:pPr>
-              <w:spacing w:before="60" w:after="60"/>
-              <w:jc w:val="center"/>
-            </w:pPr>
-            <w:r>
-              <w:rPr>
-                <w:rFonts w:ascii="Consolas" w:hAnsi="Consolas"/>
-                <w:color w:val="212121"/>
-                <w:sz w:val="19"/>
-              </w:rPr>
-              <w:t>9.000.000 VNĐ/xe</w:t>
-            </w:r>
-          </w:p>
-        </w:tc>
-        <w:tc>
-          <w:tcPr>
-            <w:tcW w:type="dxa" w:w="4277"/>
-            <w:shd w:fill="F8F9FA"/>
-            <w:tcMar>
-              <w:top w:w="50" w:type="dxa"/>
-              <w:bottom w:w="50" w:type="dxa"/>
-              <w:left w:w="70" w:type="dxa"/>
-              <w:right w:w="70" w:type="dxa"/>
-            </w:tcMar>
-          </w:tcPr>
-          <w:p>
-            <w:pPr>
-              <w:spacing w:before="60" w:after="60"/>
-              <w:jc w:val="left"/>
-            </w:pPr>
-            <w:r>
-              <w:rPr>
-                <w:rFonts w:ascii="Times New Roman" w:hAnsi="Times New Roman"/>
-                <w:color w:val="212121"/>
-                <w:sz w:val="20"/>
-              </w:rPr>
-              <w:t>Giá cước cơ sở điều động Cont 40ft tuyến Lục Ngạn - Cửa khẩu Tân Thanh (Lạng Sơn).</w:t>
-            </w:r>
-          </w:p>
-        </w:tc>
-      </w:tr>
-      <w:tr>
-        <w:trPr>
-          <w:cantSplit/>
-        </w:trPr>
-        <w:tc>
-          <w:tcPr>
-            <w:tcW w:type="dxa" w:w="2592"/>
-            <w:shd w:fill="FFFFFF"/>
-            <w:tcMar>
-              <w:top w:w="50" w:type="dxa"/>
-              <w:bottom w:w="50" w:type="dxa"/>
-              <w:left w:w="70" w:type="dxa"/>
-              <w:right w:w="70" w:type="dxa"/>
-            </w:tcMar>
-          </w:tcPr>
-          <w:p>
-            <w:pPr>
-              <w:spacing w:before="60" w:after="60"/>
-              <w:jc w:val="left"/>
-            </w:pPr>
-            <w:r>
-              <w:rPr>
-                <w:rFonts w:ascii="Times New Roman" w:hAnsi="Times New Roman"/>
-                <w:b/>
-                <w:color w:val="212121"/>
-                <w:sz w:val="20"/>
-              </w:rPr>
-              <w:t>FixedCost_j (Xe 5T)</w:t>
-            </w:r>
-          </w:p>
-        </w:tc>
-        <w:tc>
-          <w:tcPr>
-            <w:tcW w:type="dxa" w:w="2160"/>
-            <w:shd w:fill="FFFFFF"/>
-            <w:tcMar>
-              <w:top w:w="50" w:type="dxa"/>
-              <w:bottom w:w="50" w:type="dxa"/>
-              <w:left w:w="70" w:type="dxa"/>
-              <w:right w:w="70" w:type="dxa"/>
-            </w:tcMar>
-          </w:tcPr>
-          <w:p>
-            <w:pPr>
-              <w:spacing w:before="60" w:after="60"/>
-              <w:jc w:val="center"/>
-            </w:pPr>
-            <w:r>
-              <w:rPr>
-                <w:rFonts w:ascii="Consolas" w:hAnsi="Consolas"/>
-                <w:color w:val="212121"/>
-                <w:sz w:val="19"/>
-              </w:rPr>
-              <w:t>3.500.000 VNĐ/xe</w:t>
-            </w:r>
-          </w:p>
-        </w:tc>
-        <w:tc>
-          <w:tcPr>
-            <w:tcW w:type="dxa" w:w="4277"/>
-            <w:shd w:fill="FFFFFF"/>
-            <w:tcMar>
-              <w:top w:w="50" w:type="dxa"/>
-              <w:bottom w:w="50" w:type="dxa"/>
-              <w:left w:w="70" w:type="dxa"/>
-              <w:right w:w="70" w:type="dxa"/>
-            </w:tcMar>
-          </w:tcPr>
-          <w:p>
-            <w:pPr>
-              <w:spacing w:before="60" w:after="60"/>
-              <w:jc w:val="left"/>
-            </w:pPr>
-            <w:r>
-              <w:rPr>
-                <w:rFonts w:ascii="Times New Roman" w:hAnsi="Times New Roman"/>
-                <w:color w:val="212121"/>
-                <w:sz w:val="20"/>
-              </w:rPr>
-              <w:t>Giá cước cơ sở điều động xe tải lạnh 5T chạy tuyến gom nội tỉnh Bắc Giang.</w:t>
-            </w:r>
-          </w:p>
-        </w:tc>
-      </w:tr>
-      <w:tr>
-        <w:trPr>
-          <w:cantSplit/>
-        </w:trPr>
-        <w:tc>
-          <w:tcPr>
-            <w:tcW w:type="dxa" w:w="2592"/>
-            <w:shd w:fill="F8F9FA"/>
-            <w:tcMar>
-              <w:top w:w="50" w:type="dxa"/>
-              <w:bottom w:w="50" w:type="dxa"/>
-              <w:left w:w="70" w:type="dxa"/>
-              <w:right w:w="70" w:type="dxa"/>
-            </w:tcMar>
-          </w:tcPr>
-          <w:p>
-            <w:pPr>
-              <w:spacing w:before="60" w:after="60"/>
-              <w:jc w:val="left"/>
-            </w:pPr>
-            <w:r>
-              <w:rPr>
-                <w:rFonts w:ascii="Times New Roman" w:hAnsi="Times New Roman"/>
-                <w:b/>
-                <w:color w:val="212121"/>
-                <w:sz w:val="20"/>
-              </w:rPr>
-              <w:t>DeadheadCost_ji</w:t>
-            </w:r>
-          </w:p>
-        </w:tc>
-        <w:tc>
-          <w:tcPr>
-            <w:tcW w:type="dxa" w:w="2160"/>
-            <w:shd w:fill="F8F9FA"/>
-            <w:tcMar>
-              <w:top w:w="50" w:type="dxa"/>
-              <w:bottom w:w="50" w:type="dxa"/>
-              <w:left w:w="70" w:type="dxa"/>
-              <w:right w:w="70" w:type="dxa"/>
-            </w:tcMar>
-          </w:tcPr>
-          <w:p>
-            <w:pPr>
-              <w:spacing w:before="60" w:after="60"/>
-              <w:jc w:val="center"/>
-            </w:pPr>
-            <w:r>
-              <w:rPr>
-                <w:rFonts w:ascii="Consolas" w:hAnsi="Consolas"/>
-                <w:color w:val="212121"/>
-                <w:sz w:val="19"/>
-              </w:rPr>
-              <w:t>18.000 VNĐ/km rỗng</w:t>
-            </w:r>
-          </w:p>
-        </w:tc>
-        <w:tc>
-          <w:tcPr>
-            <w:tcW w:type="dxa" w:w="4277"/>
-            <w:shd w:fill="F8F9FA"/>
-            <w:tcMar>
-              <w:top w:w="50" w:type="dxa"/>
-              <w:bottom w:w="50" w:type="dxa"/>
-              <w:left w:w="70" w:type="dxa"/>
-              <w:right w:w="70" w:type="dxa"/>
-            </w:tcMar>
-          </w:tcPr>
-          <w:p>
-            <w:pPr>
-              <w:spacing w:before="60" w:after="60"/>
-              <w:jc w:val="left"/>
-            </w:pPr>
-            <w:r>
-              <w:rPr>
-                <w:rFonts w:ascii="Times New Roman" w:hAnsi="Times New Roman"/>
-                <w:color w:val="212121"/>
-                <w:sz w:val="20"/>
-              </w:rPr>
-              <w:t>Định mức chi phí dầu Diesel và hao mòn khi xe lạnh chạy rỗng đến điểm nhận hàng.</w:t>
-            </w:r>
-          </w:p>
-        </w:tc>
-      </w:tr>
-      <w:tr>
-        <w:trPr>
-          <w:cantSplit/>
-        </w:trPr>
-        <w:tc>
-          <w:tcPr>
-            <w:tcW w:type="dxa" w:w="2592"/>
-            <w:shd w:fill="FFFFFF"/>
-            <w:tcMar>
-              <w:top w:w="50" w:type="dxa"/>
-              <w:bottom w:w="50" w:type="dxa"/>
-              <w:left w:w="70" w:type="dxa"/>
-              <w:right w:w="70" w:type="dxa"/>
-            </w:tcMar>
-          </w:tcPr>
-          <w:p>
-            <w:pPr>
-              <w:spacing w:before="60" w:after="60"/>
-              <w:jc w:val="left"/>
-            </w:pPr>
-            <w:r>
-              <w:rPr>
-                <w:rFonts w:ascii="Times New Roman" w:hAnsi="Times New Roman"/>
-                <w:b/>
-                <w:color w:val="212121"/>
-                <w:sz w:val="20"/>
-              </w:rPr>
-              <w:t>Dải nhiệt độ bảo quản</w:t>
-            </w:r>
-          </w:p>
-        </w:tc>
-        <w:tc>
-          <w:tcPr>
-            <w:tcW w:type="dxa" w:w="2160"/>
-            <w:shd w:fill="FFFFFF"/>
-            <w:tcMar>
-              <w:top w:w="50" w:type="dxa"/>
-              <w:bottom w:w="50" w:type="dxa"/>
-              <w:left w:w="70" w:type="dxa"/>
-              <w:right w:w="70" w:type="dxa"/>
-            </w:tcMar>
-          </w:tcPr>
-          <w:p>
-            <w:pPr>
-              <w:spacing w:before="60" w:after="60"/>
-              <w:jc w:val="center"/>
-            </w:pPr>
-            <w:r>
-              <w:rPr>
-                <w:rFonts w:ascii="Consolas" w:hAnsi="Consolas"/>
-                <w:color w:val="212121"/>
-                <w:sz w:val="19"/>
-              </w:rPr>
-              <w:t>2°C – 4°C</w:t>
-            </w:r>
-          </w:p>
-        </w:tc>
-        <w:tc>
-          <w:tcPr>
-            <w:tcW w:type="dxa" w:w="4277"/>
-            <w:shd w:fill="FFFFFF"/>
-            <w:tcMar>
-              <w:top w:w="50" w:type="dxa"/>
-              <w:bottom w:w="50" w:type="dxa"/>
-              <w:left w:w="70" w:type="dxa"/>
-              <w:right w:w="70" w:type="dxa"/>
-            </w:tcMar>
-          </w:tcPr>
-          <w:p>
-            <w:pPr>
-              <w:spacing w:before="60" w:after="60"/>
-              <w:jc w:val="left"/>
-            </w:pPr>
-            <w:r>
-              <w:rPr>
-                <w:rFonts w:ascii="Times New Roman" w:hAnsi="Times New Roman"/>
-                <w:color w:val="212121"/>
-                <w:sz w:val="20"/>
-              </w:rPr>
-              <w:t>Ràng buộc bắt buộc của Bộ lọc tương thích để tránh quả vải bị rụng cuống và thối mốc.</w:t>
-            </w:r>
-          </w:p>
-        </w:tc>
-      </w:tr>
-    </w:tbl>
     <w:sectPr>
       <w:pgSz w:w="11909" w:h="16834"/>
-      <w:pgMar w:top="1440" w:right="1440" w:bottom="1440" w:left="1440" w:header="720" w:footer="720" w:gutter="0"/>
+      <w:pgMar w:top="1152" w:right="1224" w:bottom="1152" w:left="1224" w:header="720" w:footer="720" w:gutter="0"/>
       <w:cols w:space="720"/>
       <w:docGrid w:linePitch="360"/>
     </w:sectPr>

</xml_diff>

<commit_message>
feat: trien khai Kich ban 1 - bo hoan toan xe 5T, chuan hoa toi uu AI ~50% va Newsvendor 3 lop
</commit_message>
<xml_diff>
--- a/docs/Buoc_4_Dieu_phoi_toan_mang_MILP.docx
+++ b/docs/Buoc_4_Dieu_phoi_toan_mang_MILP.docx
@@ -329,7 +329,7 @@
           <w:rFonts w:ascii="Times New Roman" w:hAnsi="Times New Roman"/>
           <w:sz w:val="21"/>
         </w:rPr>
-        <w:t>w_i là khối lượng hàng của đơn i (Tấn); C_j là tải trọng hữu dụng của xe j (Cont 40ft = 17.28T; Xe 5T = 4.80T).</w:t>
+        <w:t>w_i là khối lượng hàng của đơn i (Tấn); C_j là tải trọng hữu dụng của Container lạnh 40 feet j (C_j = 17.28 Tấn/cont).</w:t>
       </w:r>
     </w:p>
     <w:p>
@@ -359,7 +359,7 @@
           <w:rFonts w:ascii="Times New Roman" w:hAnsi="Times New Roman"/>
           <w:sz w:val="21"/>
         </w:rPr>
-        <w:t>Chi phí thuê xe cơ sở khi xe j lăn bánh (9.0 triệu/cont 40ft; 3.5 triệu/xe 5T).</w:t>
+        <w:t>Chi phí thuê xe cơ sở khi Container lạnh 40 feet j lăn bánh (định mức 9.0 triệu VNĐ/cont).</w:t>
       </w:r>
     </w:p>
     <w:p>

</xml_diff>